<commit_message>
Add Phase 3.3 support for PPTX slides, images, and rotation functionality
</commit_message>
<xml_diff>
--- a/tests/DotnetPoi.Interop.Tests/fixtures/from-dotnet-poi/phase3_2-basic.docx
+++ b/tests/DotnetPoi.Interop.Tests/fixtures/from-dotnet-poi/phase3_2-basic.docx
@@ -5,7 +5,7 @@
     <w:p>
       <w:r>
         <w:rPr>
-          <w:b/>
+          <w:b w:val="on"/>
         </w:rPr>
         <w:t xml:space="preserve">from dotnet-poi docx</w:t>
       </w:r>
@@ -13,7 +13,7 @@
     <w:p>
       <w:r>
         <w:rPr>
-          <w:i/>
+          <w:i w:val="on"/>
         </w:rPr>
         <w:t xml:space="preserve">second paragraph</w:t>
       </w:r>

</xml_diff>

<commit_message>
Add table and hyperlink support in PPTX; implement related classes and round-trip tests
</commit_message>
<xml_diff>
--- a/tests/DotnetPoi.Interop.Tests/fixtures/from-dotnet-poi/phase3_2-basic.docx
+++ b/tests/DotnetPoi.Interop.Tests/fixtures/from-dotnet-poi/phase3_2-basic.docx
@@ -18,7 +18,10 @@
         <w:t xml:space="preserve">second paragraph</w:t>
       </w:r>
     </w:p>
-    <w:sectPr/>
+    <w:sectPr>
+      <w:pgSz w:w="12240" w:h="15840"/>
+      <w:pgMar w:top="1440" w:right="1440" w:bottom="1440" w:left="1440" w:header="720" w:footer="720"/>
+    </w:sectPr>
   </w:body>
 </w:document>
 </file>
</xml_diff>